<commit_message>
fix: correct M21 table cell answers in Methods R11
- O1: weighting values -0.0055/+0.0016 with p-values (was +0.0026/-0.0033)
- O2: Alzubaidi WCE 0.6877 vs Base 0.6844, no sig (was 0.6897, wrong claim)
- O3: B18_3 first on Alzubaidi, A_agg fourth (was A_agg first, wrong)

Co-Authored-By: Claude Sonnet 4.6 <noreply@anthropic.com>
Claude-Session: https://claude.ai/code/session_01VADmG4erFwh9AZJJyJ5yqP
</commit_message>
<xml_diff>
--- a/docs/Ofori_Prince_Phase1_Methods_R11.docx
+++ b/docs/Ofori_Prince_Phase1_Methods_R11.docx
@@ -2740,7 +2740,7 @@
                 <w:sz w:val="18"/>
                 <w:i/>
               </w:rPr>
-              <w:t>Answer: The weighting adds no measurable value (+0.0026 at depth 5, -0.0033 at depth 3); WCE does not beat the baseline on either dataset.</w:t>
+              <w:t>Answer: The weighting adds no measurable value (-0.0055 at depth 5 p=0.1652, +0.0016 at depth 3 p=0.5157, both non-significant). WCE does not beat the baseline on either dataset.</w:t>
             </w:r>
           </w:p>
         </w:tc>
@@ -2801,7 +2801,7 @@
                 <w:sz w:val="18"/>
                 <w:i/>
               </w:rPr>
-              <w:t>Answer: WCE is outperformed by Naive Bayes (p = 0.024) on KNUST; no comparator significantly beats WCE on Alzubaidi (WCE 0.6897 is the highest mean, though no pairwise comparison is significant).</w:t>
+              <w:t>Answer: WCE is outperformed by Naive Bayes (p = 0.0236) on KNUST. On Alzubaidi WCE (0.6877) is above Baseline (0.6844); no pairwise comparison is significant.</w:t>
             </w:r>
           </w:p>
         </w:tc>
@@ -2862,7 +2862,7 @@
                 <w:sz w:val="18"/>
                 <w:i/>
               </w:rPr>
-              <w:t>Answer: K_agg and A_agg rank first and second on KNUST; A_agg ranks first on Alzubaidi. This supports the KAB framework as a theoretical organiser, not as a weighting mechanism.</w:t>
+              <w:t>Answer: K_agg (0.4323) and A_agg (0.3406) rank first and second on KNUST. On Alzubaidi B18_3 (0.4288) ranks first; A_agg (0.1801) ranks fourth. K_agg does not appear in the Alzubaidi top ten. This supports the KAB framework as a theoretical organiser on KNUST.</w:t>
             </w:r>
           </w:p>
         </w:tc>

</xml_diff>

<commit_message>
Methods R11: fix VERIFY3 doc-level errors (second pass)
M16: add p-method (scipy exact/normal approx) and effect size r = |z|/sqrt(n_nontied)
M21: mark O1 as primary objective
M22 Table A: add false-negative row (High predicted Low = resources wasted)
N5: add Alzubaidi comparator significance note (DT/NB/SVM/RF p<0.001, spw p=0.0959)

Co-Authored-By: Claude Sonnet 4.6 <noreply@anthropic.com>
Claude-Session: https://claude.ai/code/session_01VADmG4erFwh9AZJJyJ5yqP
</commit_message>
<xml_diff>
--- a/docs/Ofori_Prince_Phase1_Methods_R11.docx
+++ b/docs/Ofori_Prince_Phase1_Methods_R11.docx
@@ -1479,7 +1479,7 @@
           <w:color w:val="000000"/>
           <w:sz w:val="24"/>
         </w:rPr>
-        <w:t>Eight comparators on each dataset: Baseline XGBoost (independently tuned), stock scale_pos_weight XGBoost, Decision Tree, Naive Bayes, Logistic Regression (scaled), SVM (scaled), Random Forest, and the proposed KAB-XGBoost-WCE. Each tunable model receives its own GridSearchCV on the training folds, on both datasets.</w:t>
+        <w:t>Eight comparators on each dataset: Baseline XGBoost (independently tuned), stock scale_pos_weight XGBoost, Decision Tree, Naive Bayes, Logistic Regression (scaled), SVM (scaled), Random Forest, and the proposed KAB-XGBoost-WCE. Each tunable model receives its own GridSearchCV on the training folds, on both datasets. On Alzubaidi, WCE (0.6877) is above Decision Tree, Naive Bayes, SVM, and Random Forest (all p &lt; 0.001) and above stock scale_pos_weight (p = 0.0959). Logistic Regression (0.6830) and Baseline (0.6844) are not significantly different from WCE.</w:t>
       </w:r>
     </w:p>
     <w:p>
@@ -2077,7 +2077,7 @@
           <w:color w:val="000000"/>
           <w:sz w:val="24"/>
         </w:rPr>
-        <w:t>Four-arm ablation (A vanilla depth 5, B depth 3, C depth 5 with weights, D depth 3 with weights), all from the same 5 x 10-fold protocol. Primary test: Wilcoxon signed-rank on 50 paired folds with W+, W-, p, fold-win and ties reported. The 50 fold scores are not independent (5 repeats of 10 folds share data); p-values are conservative approximations. Each of the eight pairwise comparisons uses its own Wilcoxon test. No Bonferroni correction is applied; all eight p-values are reported and readers can apply their own threshold. Artificial-skew test: the High class is downsampled to a 25% minority to test whether the weighting helps more under genuine imbalance, comparing KAB-WCE against stock scale_pos_weight.</w:t>
+        <w:t>Four-arm ablation (A vanilla depth 5, B depth 3, C depth 5 with weights, D depth 3 with weights), all from the same 5 x 10-fold protocol. Primary test: Wilcoxon signed-rank on 50 paired folds with W+, W-, p, fold-win and ties reported. The 50 fold scores are not independent (5 repeats of 10 folds share data); p-values are conservative approximations. The p-value uses scipy.stats.wilcoxon: exact when no ties and n 50 or fewer, normal approximation otherwise. Effect size: r = |z| / sqrt(n_nontied), where n_nontied is the number of non-tied pairs. Each of the eight pairwise comparisons uses its own Wilcoxon test. No Bonferroni correction is applied; all eight p-values are reported and readers can apply their own threshold. Artificial-skew test: the High class is downsampled to a 25% minority to test whether the weighting helps more under genuine imbalance, comparing KAB-WCE against stock scale_pos_weight.</w:t>
       </w:r>
     </w:p>
     <w:p>
@@ -2697,7 +2697,7 @@
                 <w:color w:val="000000"/>
                 <w:sz w:val="18"/>
               </w:rPr>
-              <w:t>O1 Propose KAB-XGBoost-WCE</w:t>
+              <w:t>O1 Propose KAB-XGBoost-WCE (primary)</w:t>
             </w:r>
           </w:p>
         </w:tc>
@@ -3070,6 +3070,72 @@
                 <w:color w:val="000000"/>
                 <w:sz w:val="18"/>
               </w:rPr>
+              <w:t>Behavioural readiness</w:t>
+            </w:r>
+          </w:p>
+        </w:tc>
+        <w:tc>
+          <w:tcPr>
+            <w:tcW w:type="dxa" w:w="2160"/>
+          </w:tcPr>
+          <w:p>
+            <w:r/>
+            <w:r>
+              <w:rPr>
+                <w:rFonts w:ascii="Times New Roman" w:hAnsi="Times New Roman"/>
+                <w:color w:val="000000"/>
+                <w:sz w:val="18"/>
+              </w:rPr>
+              <w:t>Macro F1</w:t>
+            </w:r>
+          </w:p>
+        </w:tc>
+        <w:tc>
+          <w:tcPr>
+            <w:tcW w:type="dxa" w:w="2160"/>
+          </w:tcPr>
+          <w:p>
+            <w:r/>
+            <w:r>
+              <w:rPr>
+                <w:rFonts w:ascii="Times New Roman" w:hAnsi="Times New Roman"/>
+                <w:color w:val="000000"/>
+                <w:sz w:val="18"/>
+              </w:rPr>
+              <w:t>Over-identification of risk</w:t>
+            </w:r>
+          </w:p>
+        </w:tc>
+        <w:tc>
+          <w:tcPr>
+            <w:tcW w:type="dxa" w:w="2160"/>
+          </w:tcPr>
+          <w:p>
+            <w:r/>
+            <w:r>
+              <w:rPr>
+                <w:rFonts w:ascii="Times New Roman" w:hAnsi="Times New Roman"/>
+                <w:color w:val="000000"/>
+                <w:sz w:val="18"/>
+              </w:rPr>
+              <w:t xml:space="preserve">False negative (High predicted Low) = student over-served, intervention resources spent unnecessarily</w:t>
+            </w:r>
+          </w:p>
+        </w:tc>
+      </w:tr>
+      <w:tr>
+        <w:tc>
+          <w:tcPr>
+            <w:tcW w:type="dxa" w:w="2160"/>
+          </w:tcPr>
+          <w:p>
+            <w:r/>
+            <w:r>
+              <w:rPr>
+                <w:rFonts w:ascii="Times New Roman" w:hAnsi="Times New Roman"/>
+                <w:color w:val="000000"/>
+                <w:sz w:val="18"/>
+              </w:rPr>
               <w:t>Class coverage</w:t>
             </w:r>
           </w:p>

</xml_diff>

<commit_message>
Methods R11: fix M16 arm hyperparameters, Bonferroni threshold, M10/M13 unified depth grid
M16: state arm lambda values (C: lambda=1.5, D: lambda=1.5); add Bonferroni
     alpha=0.007 for seven comparators
M10/M13: state WCE and baseline both use max_depth grid {2,3,5,7}

Co-Authored-By: Claude Sonnet 4.6 <noreply@anthropic.com>
Claude-Session: https://claude.ai/code/session_01VADmG4erFwh9AZJJyJ5yqP
</commit_message>
<xml_diff>
--- a/docs/Ofori_Prince_Phase1_Methods_R11.docx
+++ b/docs/Ofori_Prince_Phase1_Methods_R11.docx
@@ -1543,7 +1543,7 @@
           <w:color w:val="000000"/>
           <w:sz w:val="24"/>
         </w:rPr>
-        <w:t>Table 2 gives search spaces and selected values on both datasets. Baseline XGBoost tunes max_depth over {2,3,5,7} with its own GridSearchCV, independent of the WCE tuning, on each dataset. SVM and Logistic Regression are evaluated on standardised features.</w:t>
+        <w:t>Table 2 gives search spaces and selected values on both datasets. Baseline XGBoost and KAB-XGBoost-WCE both tune max_depth over {2,3,5,7}. Each uses its own GridSearchCV, run independently per fold, on each dataset. SVM and Logistic Regression are evaluated on standardised features.</w:t>
       </w:r>
     </w:p>
     <w:p>
@@ -2077,7 +2077,7 @@
           <w:color w:val="000000"/>
           <w:sz w:val="24"/>
         </w:rPr>
-        <w:t>Four-arm ablation (A vanilla depth 5, B depth 3, C depth 5 with weights, D depth 3 with weights), all from the same 5 x 10-fold protocol. Primary test: Wilcoxon signed-rank on 50 paired folds with W+, W-, p, fold-win and ties reported. The 50 fold scores are not independent (5 repeats of 10 folds share data); p-values are conservative approximations. The p-value uses scipy.stats.wilcoxon: exact when no ties and n 50 or fewer, normal approximation otherwise. Effect size: r = |z| / sqrt(n_nontied), where n_nontied is the number of non-tied pairs. Each of the eight pairwise comparisons uses its own Wilcoxon test. No Bonferroni correction is applied; all eight p-values are reported and readers can apply their own threshold. Artificial-skew test: the High class is downsampled to a 25% minority to test whether the weighting helps more under genuine imbalance, comparing KAB-WCE against stock scale_pos_weight.</w:t>
+        <w:t>Four-arm ablation (A: max_depth 5 no weighting, B: max_depth 3 no weighting, C: max_depth 5 lambda = 1.5, D: max_depth 3 lambda = 1.5), all from the same 5 x 10-fold protocol. Primary test: Wilcoxon signed-rank on 50 paired folds with W+, W-, p, fold-win and ties reported. The 50 fold scores are not independent (5 repeats of 10 folds share data); p-values are conservative approximations. The p-value uses scipy.stats.wilcoxon: exact when no ties and n 50 or fewer, normal approximation otherwise. Effect size: r = |z| / sqrt(n_nontied), where n_nontied is the number of non-tied pairs. Each of the eight pairwise comparisons uses its own Wilcoxon test. No Bonferroni correction is applied; all eight p-values are reported. Seven comparators gives a Bonferroni threshold of alpha = 0.007; readers can apply this or their own threshold. Artificial-skew test: the High class is downsampled to a 25% minority to test whether the weighting helps more under genuine imbalance, comparing KAB-WCE against stock scale_pos_weight.</w:t>
       </w:r>
     </w:p>
     <w:p>

</xml_diff>

<commit_message>
Methods R11: fix M11 comparator count, N10 cleaning rule and Alzubaidi coding
M11: seven comparators + proposed model (eight total), not "eight comparators"
N10(a): clarify 44 duplicates removed after block mapping/imputation (not raw exact-match)
N10(b/c): add Alzubaidi ordinal coding rules — B13 perception scale, do-not-know=1
          with justification, B21 severity, unmatched=3.0 neutral fill

Co-Authored-By: Claude Sonnet 4.6 <noreply@anthropic.com>
Claude-Session: https://claude.ai/code/session_01VADmG4erFwh9AZJJyJ5yqP
</commit_message>
<xml_diff>
--- a/docs/Ofori_Prince_Phase1_Methods_R11.docx
+++ b/docs/Ofori_Prince_Phase1_Methods_R11.docx
@@ -956,7 +956,7 @@
           <w:color w:val="000000"/>
           <w:sz w:val="24"/>
         </w:rPr>
-        <w:t>Alzubaidi: downloaded from Mendeley Data (doi:10.17632/fbs9mgmh4y.3); 1,231 responses, 44 exact duplicates removed, leaving 1,187 unique responses; modelled feature matrix d = 28 after block mapping (M18).</w:t>
+        <w:t>Alzubaidi: downloaded from Mendeley Data (doi:10.17632/fbs9mgmh4y.3); 1,231 responses, 44 duplicates removed (exact match on all mapped feature values after block mapping and imputation), leaving 1,187 unique responses; modelled feature matrix d = 28 after block mapping (M18).</w:t>
       </w:r>
     </w:p>
     <w:p>
@@ -1356,6 +1356,22 @@
     </w:tbl>
     <w:p>
       <w:pPr>
+        <w:spacing w:after="160" w:line="360" w:lineRule="auto"/>
+        <w:jc w:val="both"/>
+      </w:pPr>
+      <w:r>
+        <w:rPr>
+          <w:rFonts w:ascii="Times New Roman" w:hAnsi="Times New Roman"/>
+          <w:b w:val="0"/>
+          <w:i w:val="0"/>
+          <w:color w:val="000000"/>
+          <w:sz w:val="24"/>
+        </w:rPr>
+        <w:t xml:space="preserve">Alzubaidi ordinal coding. Frequency items (B19, B20, B14): always = 5, often = 4, sometimes = 3, seldom/rarely = 2, never = 1. "Do not know", "don't know", and "not sure (difficult to determine)" are coded 1 (least frequent). Justification: a participant who does not know how often they perform a security behaviour is treated as performing it infrequently. This affects approximately 45% of B19 cells. Attitude items (B18, B22): strongly agree = 5, agree = 4, neutral/undecided = 3, disagree = 2, strongly disagree = 1. Security perception B13: very secure = 5, somewhat secure = 4, neutral = 3, somewhat insecure = 2, not secure at all / very insecure = 1. Perceived severity B21: responses containing "serious" = 5, responses containing "vanish" = 1, all others = 3. Any response not matched by its map is filled with 3.0 (neutral midpoint).</w:t>
+      </w:r>
+    </w:p>
+    <w:p>
+      <w:pPr>
         <w:spacing w:after="120" w:line="360" w:lineRule="auto"/>
         <w:jc w:val="left"/>
       </w:pPr>
@@ -1479,7 +1495,7 @@
           <w:color w:val="000000"/>
           <w:sz w:val="24"/>
         </w:rPr>
-        <w:t>Eight comparators on each dataset: Baseline XGBoost (independently tuned), stock scale_pos_weight XGBoost, Decision Tree, Naive Bayes, Logistic Regression (scaled), SVM (scaled), Random Forest, and the proposed KAB-XGBoost-WCE. Each tunable model receives its own GridSearchCV on the training folds, on both datasets. On Alzubaidi, WCE (0.6877) is above Decision Tree, Naive Bayes, SVM, and Random Forest (all p &lt; 0.001) and above stock scale_pos_weight (p = 0.0959). Logistic Regression (0.6830) and Baseline (0.6844) are not significantly different from WCE.</w:t>
+        <w:t>Seven comparators on each dataset: Baseline XGBoost (independently tuned), stock scale_pos_weight XGBoost, Decision Tree, Naive Bayes, Logistic Regression (scaled), SVM (scaled), and Random Forest. The proposed KAB-XGBoost-WCE is the eighth model. Each tunable model receives its own GridSearchCV on the training folds, on both datasets. On Alzubaidi, WCE (0.6877) is above Decision Tree, Naive Bayes, SVM, and Random Forest (all p &lt; 0.001) and above stock scale_pos_weight (p = 0.0959). Logistic Regression (0.6830) and Baseline (0.6844) are not significantly different from WCE.</w:t>
       </w:r>
     </w:p>
     <w:p>

</xml_diff>

<commit_message>
Methods R11: fill HuSSREC reference number (AP/639/VOL.5)
Replace all three [INSERT HuSSREC REFERENCE NUMBER] placeholders
with the actual reference HuSSREC/AP/639/VOL.5, approved
28 September 2026.

Co-Authored-By: Claude Sonnet 4.6 <noreply@anthropic.com>
Claude-Session: https://claude.ai/code/session_01VADmG4erFwh9AZJJyJ5yqP
</commit_message>
<xml_diff>
--- a/docs/Ofori_Prince_Phase1_Methods_R11.docx
+++ b/docs/Ofori_Prince_Phase1_Methods_R11.docx
@@ -433,7 +433,7 @@
                 <w:color w:val="000000"/>
                 <w:sz w:val="18"/>
               </w:rPr>
-              <w:t>[INSERT HuSSREC REFERENCE NUMBER]</w:t>
+              <w:t>HuSSREC/AP/639/VOL.5</w:t>
             </w:r>
           </w:p>
         </w:tc>
@@ -632,7 +632,7 @@
           <w:color w:val="000000"/>
           <w:sz w:val="24"/>
         </w:rPr>
-        <w:t>KNUST field survey: primary evaluation corpus, restricted under HuSSREC terms (reference [INSERT HuSSREC REFERENCE NUMBER]). Alzubaidi (2021): public dataset, doi:10.17632/fbs9mgmh4y.3, CC BY-NC-ND 4.0, retained as an external stress-test. The two datasets are processed in separate loops with no shared state, no feature-level concatenation, and no corpus-level pooling; they are never pooled.</w:t>
+        <w:t>KNUST field survey: primary evaluation corpus, restricted under HuSSREC terms (reference HuSSREC/AP/639/VOL.5). Alzubaidi (2021): public dataset, doi:10.17632/fbs9mgmh4y.3, CC BY-NC-ND 4.0, retained as an external stress-test. The two datasets are processed in separate loops with no shared state, no feature-level concatenation, and no corpus-level pooling; they are never pooled.</w:t>
       </w:r>
     </w:p>
     <w:p>
@@ -988,7 +988,7 @@
           <w:color w:val="000000"/>
           <w:sz w:val="24"/>
         </w:rPr>
-        <w:t>Approved by the KNUST Humanities and Social Sciences Ethics Committee (HuSSREC), reference [INSERT HuSSREC REFERENCE NUMBER]. Participation was voluntary with informed consent. Predictor and outcome items were collected from the same respondent on one instrument, so common-method variance is acknowledged as a limitation.</w:t>
+        <w:t>Approved by the KNUST Humanities and Social Sciences Ethics Committee (HuSSREC), reference HuSSREC/AP/639/VOL.5. Participation was voluntary with informed consent. Predictor and outcome items were collected from the same respondent on one instrument, so common-method variance is acknowledged as a limitation.</w:t>
       </w:r>
     </w:p>
     <w:p>

</xml_diff>